<commit_message>
initial cleaned data test
</commit_message>
<xml_diff>
--- a/docs/Documentation.docx
+++ b/docs/Documentation.docx
@@ -1,6 +1,6 @@
 
 <file path=word/document.xml><?xml version="1.0" encoding="utf-8"?>
-<w:document xmlns:wpc="http://schemas.microsoft.com/office/word/2010/wordprocessingCanvas" xmlns:cx="http://schemas.microsoft.com/office/drawing/2014/chartex" xmlns:cx1="http://schemas.microsoft.com/office/drawing/2015/9/8/chartex" xmlns:cx2="http://schemas.microsoft.com/office/drawing/2015/10/21/chartex" xmlns:cx3="http://schemas.microsoft.com/office/drawing/2016/5/9/chartex" xmlns:cx4="http://schemas.microsoft.com/office/drawing/2016/5/10/chartex" xmlns:cx5="http://schemas.microsoft.com/office/drawing/2016/5/11/chartex" xmlns:cx6="http://schemas.microsoft.com/office/drawing/2016/5/12/chartex" xmlns:cx7="http://schemas.microsoft.com/office/drawing/2016/5/13/chartex" xmlns:cx8="http://schemas.microsoft.com/office/drawing/2016/5/14/chartex" xmlns:mc="http://schemas.openxmlformats.org/markup-compatibility/2006" xmlns:aink="http://schemas.microsoft.com/office/drawing/2016/ink" xmlns:am3d="http://schemas.microsoft.com/office/drawing/2017/model3d" xmlns:o="urn:schemas-microsoft-com:office:office" xmlns:oel="http://schemas.microsoft.com/office/2019/extlst" xmlns:r="http://schemas.openxmlformats.org/officeDocument/2006/relationships" xmlns:m="http://schemas.openxmlformats.org/officeDocument/2006/math" xmlns:v="urn:schemas-microsoft-com:vml" xmlns:wp14="http://schemas.microsoft.com/office/word/2010/wordprocessingDrawing" xmlns:wp="http://schemas.openxmlformats.org/drawingml/2006/wordprocessingDrawing" xmlns:w10="urn:schemas-microsoft-com:office:word" xmlns:w="http://schemas.openxmlformats.org/wordprocessingml/2006/main" xmlns:w14="http://schemas.microsoft.com/office/word/2010/wordml" xmlns:w15="http://schemas.microsoft.com/office/word/2012/wordml" xmlns:w16cei="http://schemas.microsoft.com/office/word/2026/wordml/cei" xmlns:w16cex="http://schemas.microsoft.com/office/word/2018/wordml/cex" xmlns:w16cid="http://schemas.microsoft.com/office/word/2016/wordml/cid" xmlns:w16="http://schemas.microsoft.com/office/word/2018/wordml" xmlns:w16du="http://schemas.microsoft.com/office/word/2023/wordml/word16du" xmlns:w16sdtdh="http://schemas.microsoft.com/office/word/2020/wordml/sdtdatahash" xmlns:w16sdtfl="http://schemas.microsoft.com/office/word/2024/wordml/sdtformatlock" xmlns:w16se="http://schemas.microsoft.com/office/word/2015/wordml/symex" xmlns:wpg="http://schemas.microsoft.com/office/word/2010/wordprocessingGroup" xmlns:wpi="http://schemas.microsoft.com/office/word/2010/wordprocessingInk" xmlns:wne="http://schemas.microsoft.com/office/word/2006/wordml" xmlns:wps="http://schemas.microsoft.com/office/word/2010/wordprocessingShape" mc:Ignorable="w14 w15 w16se w16cid w16 w16cex w16sdtdh w16sdtfl w16du wp14">
+<w:document xmlns:wpc="http://schemas.microsoft.com/office/word/2010/wordprocessingCanvas" xmlns:cx="http://schemas.microsoft.com/office/drawing/2014/chartex" xmlns:cx1="http://schemas.microsoft.com/office/drawing/2015/9/8/chartex" xmlns:cx2="http://schemas.microsoft.com/office/drawing/2015/10/21/chartex" xmlns:cx3="http://schemas.microsoft.com/office/drawing/2016/5/9/chartex" xmlns:cx4="http://schemas.microsoft.com/office/drawing/2016/5/10/chartex" xmlns:cx5="http://schemas.microsoft.com/office/drawing/2016/5/11/chartex" xmlns:cx6="http://schemas.microsoft.com/office/drawing/2016/5/12/chartex" xmlns:cx7="http://schemas.microsoft.com/office/drawing/2016/5/13/chartex" xmlns:cx8="http://schemas.microsoft.com/office/drawing/2016/5/14/chartex" xmlns:mc="http://schemas.openxmlformats.org/markup-compatibility/2006" xmlns:aink="http://schemas.microsoft.com/office/drawing/2016/ink" xmlns:am3d="http://schemas.microsoft.com/office/drawing/2017/model3d" xmlns:o="urn:schemas-microsoft-com:office:office" xmlns:oel="http://schemas.microsoft.com/office/2019/extlst" xmlns:r="http://schemas.openxmlformats.org/officeDocument/2006/relationships" xmlns:m="http://schemas.openxmlformats.org/officeDocument/2006/math" xmlns:v="urn:schemas-microsoft-com:vml" xmlns:wp14="http://schemas.microsoft.com/office/word/2010/wordprocessingDrawing" xmlns:wp="http://schemas.openxmlformats.org/drawingml/2006/wordprocessingDrawing" xmlns:w10="urn:schemas-microsoft-com:office:word" xmlns:w="http://schemas.openxmlformats.org/wordprocessingml/2006/main" xmlns:w14="http://schemas.microsoft.com/office/word/2010/wordml" xmlns:w15="http://schemas.microsoft.com/office/word/2012/wordml" xmlns:w16cex="http://schemas.microsoft.com/office/word/2018/wordml/cex" xmlns:w16cid="http://schemas.microsoft.com/office/word/2016/wordml/cid" xmlns:w16="http://schemas.microsoft.com/office/word/2018/wordml" xmlns:w16du="http://schemas.microsoft.com/office/word/2023/wordml/word16du" xmlns:w16sdtdh="http://schemas.microsoft.com/office/word/2020/wordml/sdtdatahash" xmlns:w16sdtfl="http://schemas.microsoft.com/office/word/2024/wordml/sdtformatlock" xmlns:w16se="http://schemas.microsoft.com/office/word/2015/wordml/symex" xmlns:wpg="http://schemas.microsoft.com/office/word/2010/wordprocessingGroup" xmlns:wpi="http://schemas.microsoft.com/office/word/2010/wordprocessingInk" xmlns:wne="http://schemas.microsoft.com/office/word/2006/wordml" xmlns:wps="http://schemas.microsoft.com/office/word/2010/wordprocessingShape" mc:Ignorable="w14 w15 w16se w16cid w16 w16cex w16sdtdh w16sdtfl w16du wp14">
   <w:body>
     <w:sdt>
       <w:sdtPr>
@@ -2315,21 +2315,7 @@
         <w:rPr>
           <w:rFonts w:cs="Times New Roman"/>
         </w:rPr>
-        <w:t>Pandas and </w:t>
-      </w:r>
-      <w:proofErr w:type="spellStart"/>
-      <w:r>
-        <w:rPr>
-          <w:rFonts w:cs="Times New Roman"/>
-        </w:rPr>
-        <w:t>numpy</w:t>
-      </w:r>
-      <w:proofErr w:type="spellEnd"/>
-      <w:r>
-        <w:rPr>
-          <w:rFonts w:cs="Times New Roman"/>
-        </w:rPr>
-        <w:t> for data wrangling</w:t>
+        <w:t>Pandas and numpy for data wrangling</w:t>
       </w:r>
     </w:p>
     <w:p>
@@ -2342,47 +2328,11 @@
           <w:rFonts w:cs="Times New Roman"/>
         </w:rPr>
       </w:pPr>
-      <w:proofErr w:type="spellStart"/>
-      <w:r>
-        <w:rPr>
-          <w:rFonts w:cs="Times New Roman"/>
-        </w:rPr>
-        <w:t>openpyxl</w:t>
-      </w:r>
-      <w:proofErr w:type="spellEnd"/>
-      <w:r>
-        <w:rPr>
-          <w:rFonts w:cs="Times New Roman"/>
-        </w:rPr>
-        <w:t> / </w:t>
-      </w:r>
-      <w:proofErr w:type="spellStart"/>
-      <w:r>
-        <w:rPr>
-          <w:rFonts w:cs="Times New Roman"/>
-        </w:rPr>
-        <w:t>xlrd</w:t>
-      </w:r>
-      <w:proofErr w:type="spellEnd"/>
-      <w:r>
-        <w:rPr>
-          <w:rFonts w:cs="Times New Roman"/>
-        </w:rPr>
-        <w:t xml:space="preserve"> for reading .xlsx / older .</w:t>
-      </w:r>
-      <w:proofErr w:type="spellStart"/>
-      <w:r>
-        <w:rPr>
-          <w:rFonts w:cs="Times New Roman"/>
-        </w:rPr>
-        <w:t>xls</w:t>
-      </w:r>
-      <w:proofErr w:type="spellEnd"/>
-      <w:r>
-        <w:rPr>
-          <w:rFonts w:cs="Times New Roman"/>
-        </w:rPr>
-        <w:t> files (Statistics Mauritius uses both)</w:t>
+      <w:r>
+        <w:rPr>
+          <w:rFonts w:cs="Times New Roman"/>
+        </w:rPr>
+        <w:t>openpyxl / xlrd for reading .xlsx / older .xls files (Statistics Mauritius uses both)</w:t>
       </w:r>
     </w:p>
     <w:p>
@@ -2395,33 +2345,11 @@
           <w:rFonts w:cs="Times New Roman"/>
         </w:rPr>
       </w:pPr>
-      <w:proofErr w:type="spellStart"/>
-      <w:r>
-        <w:rPr>
-          <w:rFonts w:cs="Times New Roman"/>
-        </w:rPr>
-        <w:t>sqlalchemy</w:t>
-      </w:r>
-      <w:proofErr w:type="spellEnd"/>
-      <w:r>
-        <w:rPr>
-          <w:rFonts w:cs="Times New Roman"/>
-        </w:rPr>
-        <w:t> and </w:t>
-      </w:r>
-      <w:proofErr w:type="spellStart"/>
-      <w:r>
-        <w:rPr>
-          <w:rFonts w:cs="Times New Roman"/>
-        </w:rPr>
-        <w:t>pyodbc</w:t>
-      </w:r>
-      <w:proofErr w:type="spellEnd"/>
-      <w:r>
-        <w:rPr>
-          <w:rFonts w:cs="Times New Roman"/>
-        </w:rPr>
-        <w:t> for connecting Python to SQL Server</w:t>
+      <w:r>
+        <w:rPr>
+          <w:rFonts w:cs="Times New Roman"/>
+        </w:rPr>
+        <w:t>sqlalchemy and pyodbc for connecting Python to SQL Server</w:t>
       </w:r>
     </w:p>
     <w:p>
@@ -2434,19 +2362,11 @@
           <w:rFonts w:cs="Times New Roman"/>
         </w:rPr>
       </w:pPr>
-      <w:proofErr w:type="spellStart"/>
-      <w:r>
-        <w:rPr>
-          <w:rFonts w:cs="Times New Roman"/>
-        </w:rPr>
-        <w:t>statsmodels</w:t>
-      </w:r>
-      <w:proofErr w:type="spellEnd"/>
-      <w:r>
-        <w:rPr>
-          <w:rFonts w:cs="Times New Roman"/>
-        </w:rPr>
-        <w:t> for seasonal decomposition / ARIMA forecasting</w:t>
+      <w:r>
+        <w:rPr>
+          <w:rFonts w:cs="Times New Roman"/>
+        </w:rPr>
+        <w:t>statsmodels for seasonal decomposition / ARIMA forecasting</w:t>
       </w:r>
     </w:p>
     <w:p>
@@ -2476,19 +2396,11 @@
           <w:rFonts w:cs="Times New Roman"/>
         </w:rPr>
       </w:pPr>
-      <w:proofErr w:type="spellStart"/>
-      <w:r>
-        <w:rPr>
-          <w:rFonts w:cs="Times New Roman"/>
-        </w:rPr>
-        <w:t>jupyter</w:t>
-      </w:r>
-      <w:proofErr w:type="spellEnd"/>
-      <w:r>
-        <w:rPr>
-          <w:rFonts w:cs="Times New Roman"/>
-        </w:rPr>
-        <w:t xml:space="preserve"> for exploratory notebooks</w:t>
+      <w:r>
+        <w:rPr>
+          <w:rFonts w:cs="Times New Roman"/>
+        </w:rPr>
+        <w:t>jupyter for exploratory notebooks</w:t>
       </w:r>
     </w:p>
     <w:p>
@@ -2619,19 +2531,11 @@
           <w:rFonts w:cs="Times New Roman"/>
         </w:rPr>
       </w:pPr>
-      <w:proofErr w:type="spellStart"/>
-      <w:r>
-        <w:rPr>
-          <w:rFonts w:cs="Times New Roman"/>
-        </w:rPr>
-        <w:t>Tidyverse</w:t>
-      </w:r>
-      <w:proofErr w:type="spellEnd"/>
-      <w:r>
-        <w:rPr>
-          <w:rFonts w:cs="Times New Roman"/>
-        </w:rPr>
-        <w:t xml:space="preserve"> for data wrangling</w:t>
+      <w:r>
+        <w:rPr>
+          <w:rFonts w:cs="Times New Roman"/>
+        </w:rPr>
+        <w:t>Tidyverse for data wrangling</w:t>
       </w:r>
     </w:p>
     <w:p>
@@ -2645,33 +2549,11 @@
           <w:rFonts w:cs="Times New Roman"/>
         </w:rPr>
       </w:pPr>
-      <w:proofErr w:type="spellStart"/>
-      <w:r>
-        <w:rPr>
-          <w:rFonts w:cs="Times New Roman"/>
-        </w:rPr>
-        <w:t>Readxl</w:t>
-      </w:r>
-      <w:proofErr w:type="spellEnd"/>
-      <w:r>
-        <w:rPr>
-          <w:rFonts w:cs="Times New Roman"/>
-        </w:rPr>
-        <w:t xml:space="preserve"> lets R read .</w:t>
-      </w:r>
-      <w:proofErr w:type="spellStart"/>
-      <w:r>
-        <w:rPr>
-          <w:rFonts w:cs="Times New Roman"/>
-        </w:rPr>
-        <w:t>xls</w:t>
-      </w:r>
-      <w:proofErr w:type="spellEnd"/>
-      <w:r>
-        <w:rPr>
-          <w:rFonts w:cs="Times New Roman"/>
-        </w:rPr>
-        <w:t xml:space="preserve"> and .xlsx files directly</w:t>
+      <w:r>
+        <w:rPr>
+          <w:rFonts w:cs="Times New Roman"/>
+        </w:rPr>
+        <w:t>Readxl lets R read .xls and .xlsx files directly</w:t>
       </w:r>
     </w:p>
     <w:p>
@@ -2689,21 +2571,7 @@
         <w:rPr>
           <w:rFonts w:cs="Times New Roman"/>
         </w:rPr>
-        <w:t xml:space="preserve">DBI and </w:t>
-      </w:r>
-      <w:proofErr w:type="spellStart"/>
-      <w:r>
-        <w:rPr>
-          <w:rFonts w:cs="Times New Roman"/>
-        </w:rPr>
-        <w:t>Odbc</w:t>
-      </w:r>
-      <w:proofErr w:type="spellEnd"/>
-      <w:r>
-        <w:rPr>
-          <w:rFonts w:cs="Times New Roman"/>
-        </w:rPr>
-        <w:t xml:space="preserve"> work together to let R connect to SQL Server</w:t>
+        <w:t>DBI and Odbc work together to let R connect to SQL Server</w:t>
       </w:r>
     </w:p>
     <w:p>
@@ -2735,19 +2603,11 @@
           <w:rFonts w:cs="Times New Roman"/>
         </w:rPr>
       </w:pPr>
-      <w:proofErr w:type="spellStart"/>
-      <w:r>
-        <w:rPr>
-          <w:rFonts w:cs="Times New Roman"/>
-        </w:rPr>
-        <w:t>Lubridate</w:t>
-      </w:r>
-      <w:proofErr w:type="spellEnd"/>
-      <w:r>
-        <w:rPr>
-          <w:rFonts w:cs="Times New Roman"/>
-        </w:rPr>
-        <w:t xml:space="preserve"> Makes working with dates in R much easier</w:t>
+      <w:r>
+        <w:rPr>
+          <w:rFonts w:cs="Times New Roman"/>
+        </w:rPr>
+        <w:t>Lubridate Makes working with dates in R much easier</w:t>
       </w:r>
     </w:p>
     <w:p>
@@ -3257,21 +3117,7 @@
         <w:rPr>
           <w:rFonts w:cs="Times New Roman"/>
         </w:rPr>
-        <w:t>A .</w:t>
-      </w:r>
-      <w:proofErr w:type="spellStart"/>
-      <w:r>
-        <w:rPr>
-          <w:rFonts w:cs="Times New Roman"/>
-        </w:rPr>
-        <w:t>gitignore</w:t>
-      </w:r>
-      <w:proofErr w:type="spellEnd"/>
-      <w:r>
-        <w:rPr>
-          <w:rFonts w:cs="Times New Roman"/>
-        </w:rPr>
-        <w:t xml:space="preserve"> file was added</w:t>
+        <w:t>A .gitignore file was added</w:t>
       </w:r>
       <w:r>
         <w:rPr>
@@ -3291,21 +3137,7 @@
         <w:rPr>
           <w:rFonts w:cs="Times New Roman"/>
         </w:rPr>
-        <w:t xml:space="preserve"> ignore any cache or unwanted files. .</w:t>
-      </w:r>
-      <w:proofErr w:type="spellStart"/>
-      <w:r>
-        <w:rPr>
-          <w:rFonts w:cs="Times New Roman"/>
-        </w:rPr>
-        <w:t>gitkeep</w:t>
-      </w:r>
-      <w:proofErr w:type="spellEnd"/>
-      <w:r>
-        <w:rPr>
-          <w:rFonts w:cs="Times New Roman"/>
-        </w:rPr>
-        <w:t xml:space="preserve"> files were added in each folder to make sure that changed were always staged at any time in the process.</w:t>
+        <w:t xml:space="preserve"> ignore any cache or unwanted files. .gitkeep files were added in each folder to make sure that changed were always staged at any time in the process.</w:t>
       </w:r>
     </w:p>
     <w:p>
@@ -3415,6 +3247,7 @@
       <w:r>
         <w:rPr>
           <w:rFonts w:cs="Times New Roman"/>
+          <w:noProof/>
         </w:rPr>
         <w:drawing>
           <wp:inline distT="0" distB="0" distL="0" distR="0" wp14:anchorId="3E0E4889" wp14:editId="58086B4E">
@@ -3673,18 +3506,311 @@
       </w:r>
     </w:p>
     <w:p>
-      <w:pPr>
-        <w:rPr>
-          <w:rFonts w:cs="Times New Roman"/>
-        </w:rPr>
-      </w:pPr>
-    </w:p>
-    <w:p>
-      <w:pPr>
-        <w:rPr>
-          <w:rFonts w:cs="Times New Roman"/>
-        </w:rPr>
-      </w:pPr>
+      <w:r>
+        <w:t xml:space="preserve">This phase required me to learn more about Jupyter notebooks and Python coding, specifically pandas and NumPy libraries. Through online tutorials, videos and help from Claude AI, I did some </w:t>
+      </w:r>
+      <w:proofErr w:type="gramStart"/>
+      <w:r>
+        <w:t>trial and error</w:t>
+      </w:r>
+      <w:proofErr w:type="gramEnd"/>
+      <w:r>
+        <w:t xml:space="preserve"> work and managed to grasp a preliminary understanding of the processes I would have to get familiar with. I used the 2</w:t>
+      </w:r>
+      <w:r>
+        <w:rPr>
+          <w:vertAlign w:val="superscript"/>
+        </w:rPr>
+        <w:t>nd</w:t>
+      </w:r>
+      <w:r>
+        <w:t xml:space="preserve"> table from my “</w:t>
+      </w:r>
+      <w:r>
+        <w:t>HS_Tourism_Yr25_220526</w:t>
+      </w:r>
+      <w:r>
+        <w:t>” file from my raw files, this contained a table of total arrivals by country by year. The format was as depicted below:</w:t>
+      </w:r>
+    </w:p>
+    <w:p>
+      <w:pPr>
+        <w:keepNext/>
+        <w:jc w:val="center"/>
+      </w:pPr>
+      <w:r>
+        <w:drawing>
+          <wp:inline distT="0" distB="0" distL="0" distR="0" wp14:anchorId="3CA2FECC" wp14:editId="542D7B7D">
+            <wp:extent cx="5731510" cy="3185160"/>
+            <wp:effectExtent l="0" t="0" r="2540" b="0"/>
+            <wp:docPr id="61365988" name="Picture 1"/>
+            <wp:cNvGraphicFramePr>
+              <a:graphicFrameLocks xmlns:a="http://schemas.openxmlformats.org/drawingml/2006/main" noChangeAspect="1"/>
+            </wp:cNvGraphicFramePr>
+            <a:graphic xmlns:a="http://schemas.openxmlformats.org/drawingml/2006/main">
+              <a:graphicData uri="http://schemas.openxmlformats.org/drawingml/2006/picture">
+                <pic:pic xmlns:pic="http://schemas.openxmlformats.org/drawingml/2006/picture">
+                  <pic:nvPicPr>
+                    <pic:cNvPr id="61365988" name=""/>
+                    <pic:cNvPicPr/>
+                  </pic:nvPicPr>
+                  <pic:blipFill>
+                    <a:blip r:embed="rId11"/>
+                    <a:stretch>
+                      <a:fillRect/>
+                    </a:stretch>
+                  </pic:blipFill>
+                  <pic:spPr>
+                    <a:xfrm>
+                      <a:off x="0" y="0"/>
+                      <a:ext cx="5731510" cy="3185160"/>
+                    </a:xfrm>
+                    <a:prstGeom prst="rect">
+                      <a:avLst/>
+                    </a:prstGeom>
+                  </pic:spPr>
+                </pic:pic>
+              </a:graphicData>
+            </a:graphic>
+          </wp:inline>
+        </w:drawing>
+      </w:r>
+    </w:p>
+    <w:p>
+      <w:pPr>
+        <w:pStyle w:val="Caption"/>
+        <w:jc w:val="center"/>
+      </w:pPr>
+      <w:r>
+        <w:t xml:space="preserve">Figure </w:t>
+      </w:r>
+      <w:fldSimple w:instr=" STYLEREF 1 \s ">
+        <w:r>
+          <w:rPr>
+            <w:noProof/>
+          </w:rPr>
+          <w:t>5</w:t>
+        </w:r>
+      </w:fldSimple>
+      <w:r>
+        <w:t>.</w:t>
+      </w:r>
+      <w:fldSimple w:instr=" SEQ Figure \* ARABIC \s 1 ">
+        <w:r>
+          <w:rPr>
+            <w:noProof/>
+          </w:rPr>
+          <w:t>1</w:t>
+        </w:r>
+      </w:fldSimple>
+      <w:r>
+        <w:t>: Raw excel sheet</w:t>
+      </w:r>
+    </w:p>
+    <w:p>
+      <w:pPr>
+        <w:rPr>
+          <w:rFonts w:cs="Times New Roman"/>
+        </w:rPr>
+      </w:pPr>
+    </w:p>
+    <w:p>
+      <w:pPr>
+        <w:rPr>
+          <w:rFonts w:cs="Times New Roman"/>
+        </w:rPr>
+      </w:pPr>
+      <w:r>
+        <w:rPr>
+          <w:rFonts w:cs="Times New Roman"/>
+        </w:rPr>
+        <w:t xml:space="preserve">Obviously, this was not usable for any of my purposes. I started by loading the table into a Jupyter notebook using the </w:t>
+      </w:r>
+      <w:proofErr w:type="gramStart"/>
+      <w:r>
+        <w:rPr>
+          <w:rFonts w:cs="Times New Roman"/>
+        </w:rPr>
+        <w:t>pandas</w:t>
+      </w:r>
+      <w:proofErr w:type="gramEnd"/>
+      <w:r>
+        <w:rPr>
+          <w:rFonts w:cs="Times New Roman"/>
+        </w:rPr>
+        <w:t xml:space="preserve"> library. I imported the data into a dataframe and started experimenting with functions till I got the result I desired. In the end, I was successful in creating a better table that I then exported into CSV format.</w:t>
+      </w:r>
+    </w:p>
+    <w:p>
+      <w:pPr>
+        <w:keepNext/>
+        <w:jc w:val="center"/>
+      </w:pPr>
+      <w:r>
+        <w:rPr>
+          <w:rFonts w:cs="Times New Roman"/>
+        </w:rPr>
+        <w:lastRenderedPageBreak/>
+        <w:drawing>
+          <wp:inline distT="0" distB="0" distL="0" distR="0" wp14:anchorId="6CA8E253" wp14:editId="2557BA44">
+            <wp:extent cx="3377453" cy="4191000"/>
+            <wp:effectExtent l="0" t="0" r="0" b="0"/>
+            <wp:docPr id="246595601" name="Picture 1"/>
+            <wp:cNvGraphicFramePr>
+              <a:graphicFrameLocks xmlns:a="http://schemas.openxmlformats.org/drawingml/2006/main" noChangeAspect="1"/>
+            </wp:cNvGraphicFramePr>
+            <a:graphic xmlns:a="http://schemas.openxmlformats.org/drawingml/2006/main">
+              <a:graphicData uri="http://schemas.openxmlformats.org/drawingml/2006/picture">
+                <pic:pic xmlns:pic="http://schemas.openxmlformats.org/drawingml/2006/picture">
+                  <pic:nvPicPr>
+                    <pic:cNvPr id="246595601" name=""/>
+                    <pic:cNvPicPr/>
+                  </pic:nvPicPr>
+                  <pic:blipFill>
+                    <a:blip r:embed="rId12"/>
+                    <a:stretch>
+                      <a:fillRect/>
+                    </a:stretch>
+                  </pic:blipFill>
+                  <pic:spPr>
+                    <a:xfrm>
+                      <a:off x="0" y="0"/>
+                      <a:ext cx="3383541" cy="4198554"/>
+                    </a:xfrm>
+                    <a:prstGeom prst="rect">
+                      <a:avLst/>
+                    </a:prstGeom>
+                  </pic:spPr>
+                </pic:pic>
+              </a:graphicData>
+            </a:graphic>
+          </wp:inline>
+        </w:drawing>
+      </w:r>
+    </w:p>
+    <w:p>
+      <w:pPr>
+        <w:pStyle w:val="Caption"/>
+        <w:jc w:val="center"/>
+      </w:pPr>
+      <w:r>
+        <w:t xml:space="preserve">Figure </w:t>
+      </w:r>
+      <w:fldSimple w:instr=" STYLEREF 1 \s ">
+        <w:r>
+          <w:rPr>
+            <w:noProof/>
+          </w:rPr>
+          <w:t>5</w:t>
+        </w:r>
+      </w:fldSimple>
+      <w:r>
+        <w:t>.</w:t>
+      </w:r>
+      <w:fldSimple w:instr=" SEQ Figure \* ARABIC \s 1 ">
+        <w:r>
+          <w:rPr>
+            <w:noProof/>
+          </w:rPr>
+          <w:t>2</w:t>
+        </w:r>
+      </w:fldSimple>
+      <w:r>
+        <w:t>: Cleaned table</w:t>
+      </w:r>
+    </w:p>
+    <w:p>
+      <w:r>
+        <w:rPr>
+          <w:rFonts w:cs="Times New Roman"/>
+        </w:rPr>
+        <w:t>To see just how usable this data would be, I loaded it into Power BI and tested if I was able to draw conclusions from it</w:t>
+      </w:r>
+    </w:p>
+    <w:p>
+      <w:pPr>
+        <w:jc w:val="center"/>
+      </w:pPr>
+      <w:r>
+        <w:rPr>
+          <w:rFonts w:cs="Times New Roman"/>
+        </w:rPr>
+        <w:t>.</w:t>
+      </w:r>
+      <w:r>
+        <w:rPr>
+          <w:rFonts w:cs="Times New Roman"/>
+        </w:rPr>
+        <w:drawing>
+          <wp:inline distT="0" distB="0" distL="0" distR="0" wp14:anchorId="530D3121" wp14:editId="6929311E">
+            <wp:extent cx="5242126" cy="3421380"/>
+            <wp:effectExtent l="0" t="0" r="0" b="7620"/>
+            <wp:docPr id="1252994241" name="Picture 1"/>
+            <wp:cNvGraphicFramePr>
+              <a:graphicFrameLocks xmlns:a="http://schemas.openxmlformats.org/drawingml/2006/main" noChangeAspect="1"/>
+            </wp:cNvGraphicFramePr>
+            <a:graphic xmlns:a="http://schemas.openxmlformats.org/drawingml/2006/main">
+              <a:graphicData uri="http://schemas.openxmlformats.org/drawingml/2006/picture">
+                <pic:pic xmlns:pic="http://schemas.openxmlformats.org/drawingml/2006/picture">
+                  <pic:nvPicPr>
+                    <pic:cNvPr id="1252994241" name=""/>
+                    <pic:cNvPicPr/>
+                  </pic:nvPicPr>
+                  <pic:blipFill>
+                    <a:blip r:embed="rId13"/>
+                    <a:stretch>
+                      <a:fillRect/>
+                    </a:stretch>
+                  </pic:blipFill>
+                  <pic:spPr>
+                    <a:xfrm>
+                      <a:off x="0" y="0"/>
+                      <a:ext cx="5264806" cy="3436182"/>
+                    </a:xfrm>
+                    <a:prstGeom prst="rect">
+                      <a:avLst/>
+                    </a:prstGeom>
+                  </pic:spPr>
+                </pic:pic>
+              </a:graphicData>
+            </a:graphic>
+          </wp:inline>
+        </w:drawing>
+      </w:r>
+    </w:p>
+    <w:p>
+      <w:pPr>
+        <w:pStyle w:val="Caption"/>
+        <w:jc w:val="center"/>
+      </w:pPr>
+      <w:r>
+        <w:t>Figure.</w:t>
+      </w:r>
+      <w:fldSimple w:instr=" SEQ Figure \* ARABIC \s 1 ">
+        <w:r>
+          <w:rPr>
+            <w:noProof/>
+          </w:rPr>
+          <w:t>3</w:t>
+        </w:r>
+      </w:fldSimple>
+      <w:r>
+        <w:t>: Initial test of cleaned data</w:t>
+      </w:r>
+    </w:p>
+    <w:p>
+      <w:pPr>
+        <w:rPr>
+          <w:rFonts w:cs="Times New Roman"/>
+        </w:rPr>
+      </w:pPr>
+      <w:r>
+        <w:rPr>
+          <w:rFonts w:cs="Times New Roman"/>
+        </w:rPr>
+        <w:lastRenderedPageBreak/>
+        <w:t>Suffice to say, the initial results were very satisfactory and promising for the future cleanup of the data.</w:t>
+      </w:r>
       <w:r>
         <w:rPr>
           <w:rFonts w:cs="Times New Roman"/>
@@ -3695,7 +3821,10 @@
     <w:sdt>
       <w:sdtPr>
         <w:rPr>
-          <w:rFonts w:ascii="Times New Roman" w:hAnsi="Times New Roman" w:cs="Times New Roman"/>
+          <w:rFonts w:ascii="Times New Roman" w:eastAsiaTheme="minorHAnsi" w:hAnsi="Times New Roman" w:cs="Times New Roman"/>
+          <w:color w:val="auto"/>
+          <w:sz w:val="24"/>
+          <w:szCs w:val="24"/>
         </w:rPr>
         <w:id w:val="1131754066"/>
         <w:docPartObj>
@@ -3703,14 +3832,6 @@
           <w:docPartUnique/>
         </w:docPartObj>
       </w:sdtPr>
-      <w:sdtEndPr>
-        <w:rPr>
-          <w:rFonts w:eastAsiaTheme="minorHAnsi"/>
-          <w:color w:val="auto"/>
-          <w:sz w:val="24"/>
-          <w:szCs w:val="24"/>
-        </w:rPr>
-      </w:sdtEndPr>
       <w:sdtContent>
         <w:p>
           <w:pPr>
@@ -3809,7 +3930,7 @@
       </w:pPr>
     </w:p>
     <w:sectPr>
-      <w:footerReference w:type="default" r:id="rId11"/>
+      <w:footerReference w:type="default" r:id="rId14"/>
       <w:pgSz w:w="11906" w:h="16838"/>
       <w:pgMar w:top="1440" w:right="1440" w:bottom="1440" w:left="1440" w:header="708" w:footer="708" w:gutter="0"/>
       <w:pgNumType w:start="0"/>
@@ -3822,7 +3943,7 @@
 </file>
 
 <file path=word/endnotes.xml><?xml version="1.0" encoding="utf-8"?>
-<w:endnotes xmlns:wpc="http://schemas.microsoft.com/office/word/2010/wordprocessingCanvas" xmlns:cx="http://schemas.microsoft.com/office/drawing/2014/chartex" xmlns:cx1="http://schemas.microsoft.com/office/drawing/2015/9/8/chartex" xmlns:cx2="http://schemas.microsoft.com/office/drawing/2015/10/21/chartex" xmlns:cx3="http://schemas.microsoft.com/office/drawing/2016/5/9/chartex" xmlns:cx4="http://schemas.microsoft.com/office/drawing/2016/5/10/chartex" xmlns:cx5="http://schemas.microsoft.com/office/drawing/2016/5/11/chartex" xmlns:cx6="http://schemas.microsoft.com/office/drawing/2016/5/12/chartex" xmlns:cx7="http://schemas.microsoft.com/office/drawing/2016/5/13/chartex" xmlns:cx8="http://schemas.microsoft.com/office/drawing/2016/5/14/chartex" xmlns:mc="http://schemas.openxmlformats.org/markup-compatibility/2006" xmlns:aink="http://schemas.microsoft.com/office/drawing/2016/ink" xmlns:am3d="http://schemas.microsoft.com/office/drawing/2017/model3d" xmlns:o="urn:schemas-microsoft-com:office:office" xmlns:oel="http://schemas.microsoft.com/office/2019/extlst" xmlns:r="http://schemas.openxmlformats.org/officeDocument/2006/relationships" xmlns:m="http://schemas.openxmlformats.org/officeDocument/2006/math" xmlns:v="urn:schemas-microsoft-com:vml" xmlns:wp14="http://schemas.microsoft.com/office/word/2010/wordprocessingDrawing" xmlns:wp="http://schemas.openxmlformats.org/drawingml/2006/wordprocessingDrawing" xmlns:w10="urn:schemas-microsoft-com:office:word" xmlns:w="http://schemas.openxmlformats.org/wordprocessingml/2006/main" xmlns:w14="http://schemas.microsoft.com/office/word/2010/wordml" xmlns:w15="http://schemas.microsoft.com/office/word/2012/wordml" xmlns:w16cei="http://schemas.microsoft.com/office/word/2026/wordml/cei" xmlns:w16cex="http://schemas.microsoft.com/office/word/2018/wordml/cex" xmlns:w16cid="http://schemas.microsoft.com/office/word/2016/wordml/cid" xmlns:w16="http://schemas.microsoft.com/office/word/2018/wordml" xmlns:w16du="http://schemas.microsoft.com/office/word/2023/wordml/word16du" xmlns:w16sdtdh="http://schemas.microsoft.com/office/word/2020/wordml/sdtdatahash" xmlns:w16sdtfl="http://schemas.microsoft.com/office/word/2024/wordml/sdtformatlock" xmlns:w16se="http://schemas.microsoft.com/office/word/2015/wordml/symex" xmlns:wpg="http://schemas.microsoft.com/office/word/2010/wordprocessingGroup" xmlns:wpi="http://schemas.microsoft.com/office/word/2010/wordprocessingInk" xmlns:wne="http://schemas.microsoft.com/office/word/2006/wordml" xmlns:wps="http://schemas.microsoft.com/office/word/2010/wordprocessingShape" mc:Ignorable="w14 w15 w16se w16cid w16 w16cex w16sdtdh w16sdtfl w16du wp14">
+<w:endnotes xmlns:wpc="http://schemas.microsoft.com/office/word/2010/wordprocessingCanvas" xmlns:cx="http://schemas.microsoft.com/office/drawing/2014/chartex" xmlns:cx1="http://schemas.microsoft.com/office/drawing/2015/9/8/chartex" xmlns:cx2="http://schemas.microsoft.com/office/drawing/2015/10/21/chartex" xmlns:cx3="http://schemas.microsoft.com/office/drawing/2016/5/9/chartex" xmlns:cx4="http://schemas.microsoft.com/office/drawing/2016/5/10/chartex" xmlns:cx5="http://schemas.microsoft.com/office/drawing/2016/5/11/chartex" xmlns:cx6="http://schemas.microsoft.com/office/drawing/2016/5/12/chartex" xmlns:cx7="http://schemas.microsoft.com/office/drawing/2016/5/13/chartex" xmlns:cx8="http://schemas.microsoft.com/office/drawing/2016/5/14/chartex" xmlns:mc="http://schemas.openxmlformats.org/markup-compatibility/2006" xmlns:aink="http://schemas.microsoft.com/office/drawing/2016/ink" xmlns:am3d="http://schemas.microsoft.com/office/drawing/2017/model3d" xmlns:o="urn:schemas-microsoft-com:office:office" xmlns:oel="http://schemas.microsoft.com/office/2019/extlst" xmlns:r="http://schemas.openxmlformats.org/officeDocument/2006/relationships" xmlns:m="http://schemas.openxmlformats.org/officeDocument/2006/math" xmlns:v="urn:schemas-microsoft-com:vml" xmlns:wp14="http://schemas.microsoft.com/office/word/2010/wordprocessingDrawing" xmlns:wp="http://schemas.openxmlformats.org/drawingml/2006/wordprocessingDrawing" xmlns:w10="urn:schemas-microsoft-com:office:word" xmlns:w="http://schemas.openxmlformats.org/wordprocessingml/2006/main" xmlns:w14="http://schemas.microsoft.com/office/word/2010/wordml" xmlns:w15="http://schemas.microsoft.com/office/word/2012/wordml" xmlns:w16cex="http://schemas.microsoft.com/office/word/2018/wordml/cex" xmlns:w16cid="http://schemas.microsoft.com/office/word/2016/wordml/cid" xmlns:w16="http://schemas.microsoft.com/office/word/2018/wordml" xmlns:w16du="http://schemas.microsoft.com/office/word/2023/wordml/word16du" xmlns:w16sdtdh="http://schemas.microsoft.com/office/word/2020/wordml/sdtdatahash" xmlns:w16sdtfl="http://schemas.microsoft.com/office/word/2024/wordml/sdtformatlock" xmlns:w16se="http://schemas.microsoft.com/office/word/2015/wordml/symex" xmlns:wpg="http://schemas.microsoft.com/office/word/2010/wordprocessingGroup" xmlns:wpi="http://schemas.microsoft.com/office/word/2010/wordprocessingInk" xmlns:wne="http://schemas.microsoft.com/office/word/2006/wordml" xmlns:wps="http://schemas.microsoft.com/office/word/2010/wordprocessingShape" mc:Ignorable="w14 w15 w16se w16cid w16 w16cex w16sdtdh w16sdtfl w16du wp14">
   <w:endnote w:type="separator" w:id="-1">
     <w:p>
       <w:pPr>
@@ -3847,7 +3968,7 @@
 </file>
 
 <file path=word/footer1.xml><?xml version="1.0" encoding="utf-8"?>
-<w:ftr xmlns:wpc="http://schemas.microsoft.com/office/word/2010/wordprocessingCanvas" xmlns:cx="http://schemas.microsoft.com/office/drawing/2014/chartex" xmlns:cx1="http://schemas.microsoft.com/office/drawing/2015/9/8/chartex" xmlns:cx2="http://schemas.microsoft.com/office/drawing/2015/10/21/chartex" xmlns:cx3="http://schemas.microsoft.com/office/drawing/2016/5/9/chartex" xmlns:cx4="http://schemas.microsoft.com/office/drawing/2016/5/10/chartex" xmlns:cx5="http://schemas.microsoft.com/office/drawing/2016/5/11/chartex" xmlns:cx6="http://schemas.microsoft.com/office/drawing/2016/5/12/chartex" xmlns:cx7="http://schemas.microsoft.com/office/drawing/2016/5/13/chartex" xmlns:cx8="http://schemas.microsoft.com/office/drawing/2016/5/14/chartex" xmlns:mc="http://schemas.openxmlformats.org/markup-compatibility/2006" xmlns:aink="http://schemas.microsoft.com/office/drawing/2016/ink" xmlns:am3d="http://schemas.microsoft.com/office/drawing/2017/model3d" xmlns:o="urn:schemas-microsoft-com:office:office" xmlns:oel="http://schemas.microsoft.com/office/2019/extlst" xmlns:r="http://schemas.openxmlformats.org/officeDocument/2006/relationships" xmlns:m="http://schemas.openxmlformats.org/officeDocument/2006/math" xmlns:v="urn:schemas-microsoft-com:vml" xmlns:wp14="http://schemas.microsoft.com/office/word/2010/wordprocessingDrawing" xmlns:wp="http://schemas.openxmlformats.org/drawingml/2006/wordprocessingDrawing" xmlns:w10="urn:schemas-microsoft-com:office:word" xmlns:w="http://schemas.openxmlformats.org/wordprocessingml/2006/main" xmlns:w14="http://schemas.microsoft.com/office/word/2010/wordml" xmlns:w15="http://schemas.microsoft.com/office/word/2012/wordml" xmlns:w16cei="http://schemas.microsoft.com/office/word/2026/wordml/cei" xmlns:w16cex="http://schemas.microsoft.com/office/word/2018/wordml/cex" xmlns:w16cid="http://schemas.microsoft.com/office/word/2016/wordml/cid" xmlns:w16="http://schemas.microsoft.com/office/word/2018/wordml" xmlns:w16du="http://schemas.microsoft.com/office/word/2023/wordml/word16du" xmlns:w16sdtdh="http://schemas.microsoft.com/office/word/2020/wordml/sdtdatahash" xmlns:w16sdtfl="http://schemas.microsoft.com/office/word/2024/wordml/sdtformatlock" xmlns:w16se="http://schemas.microsoft.com/office/word/2015/wordml/symex" xmlns:wpg="http://schemas.microsoft.com/office/word/2010/wordprocessingGroup" xmlns:wpi="http://schemas.microsoft.com/office/word/2010/wordprocessingInk" xmlns:wne="http://schemas.microsoft.com/office/word/2006/wordml" xmlns:wps="http://schemas.microsoft.com/office/word/2010/wordprocessingShape" mc:Ignorable="w14 w15 w16se w16cid w16 w16cex w16sdtdh w16sdtfl w16du wp14">
+<w:ftr xmlns:wpc="http://schemas.microsoft.com/office/word/2010/wordprocessingCanvas" xmlns:cx="http://schemas.microsoft.com/office/drawing/2014/chartex" xmlns:cx1="http://schemas.microsoft.com/office/drawing/2015/9/8/chartex" xmlns:cx2="http://schemas.microsoft.com/office/drawing/2015/10/21/chartex" xmlns:cx3="http://schemas.microsoft.com/office/drawing/2016/5/9/chartex" xmlns:cx4="http://schemas.microsoft.com/office/drawing/2016/5/10/chartex" xmlns:cx5="http://schemas.microsoft.com/office/drawing/2016/5/11/chartex" xmlns:cx6="http://schemas.microsoft.com/office/drawing/2016/5/12/chartex" xmlns:cx7="http://schemas.microsoft.com/office/drawing/2016/5/13/chartex" xmlns:cx8="http://schemas.microsoft.com/office/drawing/2016/5/14/chartex" xmlns:mc="http://schemas.openxmlformats.org/markup-compatibility/2006" xmlns:aink="http://schemas.microsoft.com/office/drawing/2016/ink" xmlns:am3d="http://schemas.microsoft.com/office/drawing/2017/model3d" xmlns:o="urn:schemas-microsoft-com:office:office" xmlns:oel="http://schemas.microsoft.com/office/2019/extlst" xmlns:r="http://schemas.openxmlformats.org/officeDocument/2006/relationships" xmlns:m="http://schemas.openxmlformats.org/officeDocument/2006/math" xmlns:v="urn:schemas-microsoft-com:vml" xmlns:wp14="http://schemas.microsoft.com/office/word/2010/wordprocessingDrawing" xmlns:wp="http://schemas.openxmlformats.org/drawingml/2006/wordprocessingDrawing" xmlns:w10="urn:schemas-microsoft-com:office:word" xmlns:w="http://schemas.openxmlformats.org/wordprocessingml/2006/main" xmlns:w14="http://schemas.microsoft.com/office/word/2010/wordml" xmlns:w15="http://schemas.microsoft.com/office/word/2012/wordml" xmlns:w16cex="http://schemas.microsoft.com/office/word/2018/wordml/cex" xmlns:w16cid="http://schemas.microsoft.com/office/word/2016/wordml/cid" xmlns:w16="http://schemas.microsoft.com/office/word/2018/wordml" xmlns:w16du="http://schemas.microsoft.com/office/word/2023/wordml/word16du" xmlns:w16sdtdh="http://schemas.microsoft.com/office/word/2020/wordml/sdtdatahash" xmlns:w16sdtfl="http://schemas.microsoft.com/office/word/2024/wordml/sdtformatlock" xmlns:w16se="http://schemas.microsoft.com/office/word/2015/wordml/symex" xmlns:wpg="http://schemas.microsoft.com/office/word/2010/wordprocessingGroup" xmlns:wpi="http://schemas.microsoft.com/office/word/2010/wordprocessingInk" xmlns:wne="http://schemas.microsoft.com/office/word/2006/wordml" xmlns:wps="http://schemas.microsoft.com/office/word/2010/wordprocessingShape" mc:Ignorable="w14 w15 w16se w16cid w16 w16cex w16sdtdh w16sdtfl w16du wp14">
   <w:sdt>
     <w:sdtPr>
       <w:id w:val="1195888458"/>
@@ -3925,7 +4046,7 @@
 </file>
 
 <file path=word/footnotes.xml><?xml version="1.0" encoding="utf-8"?>
-<w:footnotes xmlns:wpc="http://schemas.microsoft.com/office/word/2010/wordprocessingCanvas" xmlns:cx="http://schemas.microsoft.com/office/drawing/2014/chartex" xmlns:cx1="http://schemas.microsoft.com/office/drawing/2015/9/8/chartex" xmlns:cx2="http://schemas.microsoft.com/office/drawing/2015/10/21/chartex" xmlns:cx3="http://schemas.microsoft.com/office/drawing/2016/5/9/chartex" xmlns:cx4="http://schemas.microsoft.com/office/drawing/2016/5/10/chartex" xmlns:cx5="http://schemas.microsoft.com/office/drawing/2016/5/11/chartex" xmlns:cx6="http://schemas.microsoft.com/office/drawing/2016/5/12/chartex" xmlns:cx7="http://schemas.microsoft.com/office/drawing/2016/5/13/chartex" xmlns:cx8="http://schemas.microsoft.com/office/drawing/2016/5/14/chartex" xmlns:mc="http://schemas.openxmlformats.org/markup-compatibility/2006" xmlns:aink="http://schemas.microsoft.com/office/drawing/2016/ink" xmlns:am3d="http://schemas.microsoft.com/office/drawing/2017/model3d" xmlns:o="urn:schemas-microsoft-com:office:office" xmlns:oel="http://schemas.microsoft.com/office/2019/extlst" xmlns:r="http://schemas.openxmlformats.org/officeDocument/2006/relationships" xmlns:m="http://schemas.openxmlformats.org/officeDocument/2006/math" xmlns:v="urn:schemas-microsoft-com:vml" xmlns:wp14="http://schemas.microsoft.com/office/word/2010/wordprocessingDrawing" xmlns:wp="http://schemas.openxmlformats.org/drawingml/2006/wordprocessingDrawing" xmlns:w10="urn:schemas-microsoft-com:office:word" xmlns:w="http://schemas.openxmlformats.org/wordprocessingml/2006/main" xmlns:w14="http://schemas.microsoft.com/office/word/2010/wordml" xmlns:w15="http://schemas.microsoft.com/office/word/2012/wordml" xmlns:w16cei="http://schemas.microsoft.com/office/word/2026/wordml/cei" xmlns:w16cex="http://schemas.microsoft.com/office/word/2018/wordml/cex" xmlns:w16cid="http://schemas.microsoft.com/office/word/2016/wordml/cid" xmlns:w16="http://schemas.microsoft.com/office/word/2018/wordml" xmlns:w16du="http://schemas.microsoft.com/office/word/2023/wordml/word16du" xmlns:w16sdtdh="http://schemas.microsoft.com/office/word/2020/wordml/sdtdatahash" xmlns:w16sdtfl="http://schemas.microsoft.com/office/word/2024/wordml/sdtformatlock" xmlns:w16se="http://schemas.microsoft.com/office/word/2015/wordml/symex" xmlns:wpg="http://schemas.microsoft.com/office/word/2010/wordprocessingGroup" xmlns:wpi="http://schemas.microsoft.com/office/word/2010/wordprocessingInk" xmlns:wne="http://schemas.microsoft.com/office/word/2006/wordml" xmlns:wps="http://schemas.microsoft.com/office/word/2010/wordprocessingShape" mc:Ignorable="w14 w15 w16se w16cid w16 w16cex w16sdtdh w16sdtfl w16du wp14">
+<w:footnotes xmlns:wpc="http://schemas.microsoft.com/office/word/2010/wordprocessingCanvas" xmlns:cx="http://schemas.microsoft.com/office/drawing/2014/chartex" xmlns:cx1="http://schemas.microsoft.com/office/drawing/2015/9/8/chartex" xmlns:cx2="http://schemas.microsoft.com/office/drawing/2015/10/21/chartex" xmlns:cx3="http://schemas.microsoft.com/office/drawing/2016/5/9/chartex" xmlns:cx4="http://schemas.microsoft.com/office/drawing/2016/5/10/chartex" xmlns:cx5="http://schemas.microsoft.com/office/drawing/2016/5/11/chartex" xmlns:cx6="http://schemas.microsoft.com/office/drawing/2016/5/12/chartex" xmlns:cx7="http://schemas.microsoft.com/office/drawing/2016/5/13/chartex" xmlns:cx8="http://schemas.microsoft.com/office/drawing/2016/5/14/chartex" xmlns:mc="http://schemas.openxmlformats.org/markup-compatibility/2006" xmlns:aink="http://schemas.microsoft.com/office/drawing/2016/ink" xmlns:am3d="http://schemas.microsoft.com/office/drawing/2017/model3d" xmlns:o="urn:schemas-microsoft-com:office:office" xmlns:oel="http://schemas.microsoft.com/office/2019/extlst" xmlns:r="http://schemas.openxmlformats.org/officeDocument/2006/relationships" xmlns:m="http://schemas.openxmlformats.org/officeDocument/2006/math" xmlns:v="urn:schemas-microsoft-com:vml" xmlns:wp14="http://schemas.microsoft.com/office/word/2010/wordprocessingDrawing" xmlns:wp="http://schemas.openxmlformats.org/drawingml/2006/wordprocessingDrawing" xmlns:w10="urn:schemas-microsoft-com:office:word" xmlns:w="http://schemas.openxmlformats.org/wordprocessingml/2006/main" xmlns:w14="http://schemas.microsoft.com/office/word/2010/wordml" xmlns:w15="http://schemas.microsoft.com/office/word/2012/wordml" xmlns:w16cex="http://schemas.microsoft.com/office/word/2018/wordml/cex" xmlns:w16cid="http://schemas.microsoft.com/office/word/2016/wordml/cid" xmlns:w16="http://schemas.microsoft.com/office/word/2018/wordml" xmlns:w16du="http://schemas.microsoft.com/office/word/2023/wordml/word16du" xmlns:w16sdtdh="http://schemas.microsoft.com/office/word/2020/wordml/sdtdatahash" xmlns:w16sdtfl="http://schemas.microsoft.com/office/word/2024/wordml/sdtformatlock" xmlns:w16se="http://schemas.microsoft.com/office/word/2015/wordml/symex" xmlns:wpg="http://schemas.microsoft.com/office/word/2010/wordprocessingGroup" xmlns:wpi="http://schemas.microsoft.com/office/word/2010/wordprocessingInk" xmlns:wne="http://schemas.microsoft.com/office/word/2006/wordml" xmlns:wps="http://schemas.microsoft.com/office/word/2010/wordprocessingShape" mc:Ignorable="w14 w15 w16se w16cid w16 w16cex w16sdtdh w16sdtfl w16du wp14">
   <w:footnote w:type="separator" w:id="-1">
     <w:p>
       <w:pPr>
@@ -3950,7 +4071,7 @@
 </file>
 
 <file path=word/numbering.xml><?xml version="1.0" encoding="utf-8"?>
-<w:numbering xmlns:wpc="http://schemas.microsoft.com/office/word/2010/wordprocessingCanvas" xmlns:cx="http://schemas.microsoft.com/office/drawing/2014/chartex" xmlns:cx1="http://schemas.microsoft.com/office/drawing/2015/9/8/chartex" xmlns:cx2="http://schemas.microsoft.com/office/drawing/2015/10/21/chartex" xmlns:cx3="http://schemas.microsoft.com/office/drawing/2016/5/9/chartex" xmlns:cx4="http://schemas.microsoft.com/office/drawing/2016/5/10/chartex" xmlns:cx5="http://schemas.microsoft.com/office/drawing/2016/5/11/chartex" xmlns:cx6="http://schemas.microsoft.com/office/drawing/2016/5/12/chartex" xmlns:cx7="http://schemas.microsoft.com/office/drawing/2016/5/13/chartex" xmlns:cx8="http://schemas.microsoft.com/office/drawing/2016/5/14/chartex" xmlns:mc="http://schemas.openxmlformats.org/markup-compatibility/2006" xmlns:aink="http://schemas.microsoft.com/office/drawing/2016/ink" xmlns:am3d="http://schemas.microsoft.com/office/drawing/2017/model3d" xmlns:o="urn:schemas-microsoft-com:office:office" xmlns:oel="http://schemas.microsoft.com/office/2019/extlst" xmlns:r="http://schemas.openxmlformats.org/officeDocument/2006/relationships" xmlns:m="http://schemas.openxmlformats.org/officeDocument/2006/math" xmlns:v="urn:schemas-microsoft-com:vml" xmlns:wp14="http://schemas.microsoft.com/office/word/2010/wordprocessingDrawing" xmlns:wp="http://schemas.openxmlformats.org/drawingml/2006/wordprocessingDrawing" xmlns:w10="urn:schemas-microsoft-com:office:word" xmlns:w="http://schemas.openxmlformats.org/wordprocessingml/2006/main" xmlns:w14="http://schemas.microsoft.com/office/word/2010/wordml" xmlns:w15="http://schemas.microsoft.com/office/word/2012/wordml" xmlns:w16cei="http://schemas.microsoft.com/office/word/2026/wordml/cei" xmlns:w16cex="http://schemas.microsoft.com/office/word/2018/wordml/cex" xmlns:w16cid="http://schemas.microsoft.com/office/word/2016/wordml/cid" xmlns:w16="http://schemas.microsoft.com/office/word/2018/wordml" xmlns:w16du="http://schemas.microsoft.com/office/word/2023/wordml/word16du" xmlns:w16sdtdh="http://schemas.microsoft.com/office/word/2020/wordml/sdtdatahash" xmlns:w16sdtfl="http://schemas.microsoft.com/office/word/2024/wordml/sdtformatlock" xmlns:w16se="http://schemas.microsoft.com/office/word/2015/wordml/symex" xmlns:wpg="http://schemas.microsoft.com/office/word/2010/wordprocessingGroup" xmlns:wpi="http://schemas.microsoft.com/office/word/2010/wordprocessingInk" xmlns:wne="http://schemas.microsoft.com/office/word/2006/wordml" xmlns:wps="http://schemas.microsoft.com/office/word/2010/wordprocessingShape" mc:Ignorable="w14 w15 w16se w16cid w16 w16cex w16sdtdh w16sdtfl w16du wp14">
+<w:numbering xmlns:wpc="http://schemas.microsoft.com/office/word/2010/wordprocessingCanvas" xmlns:cx="http://schemas.microsoft.com/office/drawing/2014/chartex" xmlns:cx1="http://schemas.microsoft.com/office/drawing/2015/9/8/chartex" xmlns:cx2="http://schemas.microsoft.com/office/drawing/2015/10/21/chartex" xmlns:cx3="http://schemas.microsoft.com/office/drawing/2016/5/9/chartex" xmlns:cx4="http://schemas.microsoft.com/office/drawing/2016/5/10/chartex" xmlns:cx5="http://schemas.microsoft.com/office/drawing/2016/5/11/chartex" xmlns:cx6="http://schemas.microsoft.com/office/drawing/2016/5/12/chartex" xmlns:cx7="http://schemas.microsoft.com/office/drawing/2016/5/13/chartex" xmlns:cx8="http://schemas.microsoft.com/office/drawing/2016/5/14/chartex" xmlns:mc="http://schemas.openxmlformats.org/markup-compatibility/2006" xmlns:aink="http://schemas.microsoft.com/office/drawing/2016/ink" xmlns:am3d="http://schemas.microsoft.com/office/drawing/2017/model3d" xmlns:o="urn:schemas-microsoft-com:office:office" xmlns:oel="http://schemas.microsoft.com/office/2019/extlst" xmlns:r="http://schemas.openxmlformats.org/officeDocument/2006/relationships" xmlns:m="http://schemas.openxmlformats.org/officeDocument/2006/math" xmlns:v="urn:schemas-microsoft-com:vml" xmlns:wp14="http://schemas.microsoft.com/office/word/2010/wordprocessingDrawing" xmlns:wp="http://schemas.openxmlformats.org/drawingml/2006/wordprocessingDrawing" xmlns:w10="urn:schemas-microsoft-com:office:word" xmlns:w="http://schemas.openxmlformats.org/wordprocessingml/2006/main" xmlns:w14="http://schemas.microsoft.com/office/word/2010/wordml" xmlns:w15="http://schemas.microsoft.com/office/word/2012/wordml" xmlns:w16cex="http://schemas.microsoft.com/office/word/2018/wordml/cex" xmlns:w16cid="http://schemas.microsoft.com/office/word/2016/wordml/cid" xmlns:w16="http://schemas.microsoft.com/office/word/2018/wordml" xmlns:w16du="http://schemas.microsoft.com/office/word/2023/wordml/word16du" xmlns:w16sdtdh="http://schemas.microsoft.com/office/word/2020/wordml/sdtdatahash" xmlns:w16sdtfl="http://schemas.microsoft.com/office/word/2024/wordml/sdtformatlock" xmlns:w16se="http://schemas.microsoft.com/office/word/2015/wordml/symex" xmlns:wpg="http://schemas.microsoft.com/office/word/2010/wordprocessingGroup" xmlns:wpi="http://schemas.microsoft.com/office/word/2010/wordprocessingInk" xmlns:wne="http://schemas.microsoft.com/office/word/2006/wordml" xmlns:wps="http://schemas.microsoft.com/office/word/2010/wordprocessingShape" mc:Ignorable="w14 w15 w16se w16cid w16 w16cex w16sdtdh w16sdtfl w16du wp14">
   <w:abstractNum w:abstractNumId="0" w15:restartNumberingAfterBreak="0">
     <w:nsid w:val="032A0A4F"/>
     <w:multiLevelType w:val="hybridMultilevel"/>

</xml_diff>